<commit_message>
Project 05 is ready
</commit_message>
<xml_diff>
--- a/guide_builder/P05_Around_The_Cone_Guide.docx
+++ b/guide_builder/P05_Around_The_Cone_Guide.docx
@@ -1891,7 +1891,7 @@
                 <w:sz w:val="19"/>
                 <w:szCs w:val="19"/>
               </w:rPr>
-              <w:t xml:space="preserve">STRAIGHT_1_SECONDS = 3.0</w:t>
+              <w:t xml:space="preserve">TIME_TO_CONE = 3.0</w:t>
             </w:r>
           </w:p>
         </w:tc>
@@ -2036,7 +2036,7 @@
                 <w:sz w:val="19"/>
                 <w:szCs w:val="19"/>
               </w:rPr>
-              <w:t xml:space="preserve">time.sleep(STRAIGHT_1_SECONDS)</w:t>
+              <w:t xml:space="preserve">time.sleep(TIME_TO_CONE)</w:t>
             </w:r>
           </w:p>
         </w:tc>
@@ -2063,7 +2063,7 @@
           <w:sz w:val="22"/>
           <w:szCs w:val="22"/>
         </w:rPr>
-        <w:t xml:space="preserve">Put the robot in the start box, unplug the cable, and hold OK.</w:t>
+        <w:t xml:space="preserve">Put the robot in the start box, turn it on, and press OK.</w:t>
       </w:r>
     </w:p>
     <w:p>
@@ -2110,7 +2110,7 @@
           <w:sz w:val="19"/>
           <w:szCs w:val="19"/>
         </w:rPr>
-        <w:t xml:space="preserve">STRAIGHT_1_SECONDS</w:t>
+        <w:t xml:space="preserve">TIME_TO_CONE</w:t>
       </w:r>
       <w:r>
         <w:rPr>
@@ -2159,7 +2159,7 @@
           <w:sz w:val="19"/>
           <w:szCs w:val="19"/>
         </w:rPr>
-        <w:t xml:space="preserve">STRAIGHT_1_SECONDS</w:t>
+        <w:t xml:space="preserve">TIME_TO_CONE</w:t>
       </w:r>
       <w:r>
         <w:rPr>
@@ -2227,7 +2227,7 @@
                 <w:sz w:val="19"/>
                 <w:szCs w:val="19"/>
               </w:rPr>
-              <w:t xml:space="preserve">ARC_SECONDS = 6.0</w:t>
+              <w:t xml:space="preserve">TIME_TURNING = 6.0</w:t>
             </w:r>
           </w:p>
         </w:tc>
@@ -2358,7 +2358,7 @@
                 <w:sz w:val="19"/>
                 <w:szCs w:val="19"/>
               </w:rPr>
-              <w:t xml:space="preserve">time.sleep(ARC_SECONDS)</w:t>
+              <w:t xml:space="preserve">time.sleep(TIME_TURNING)</w:t>
             </w:r>
           </w:p>
         </w:tc>
@@ -2447,7 +2447,7 @@
           <w:sz w:val="22"/>
           <w:szCs w:val="22"/>
         </w:rPr>
-        <w:t xml:space="preserve">`ARC_SECONDS` sets how far around it goes.</w:t>
+        <w:t xml:space="preserve">`TIME_TURNING` sets how far around it goes.</w:t>
       </w:r>
       <w:r>
         <w:rPr>
@@ -2548,7 +2548,7 @@
                 <w:sz w:val="19"/>
                 <w:szCs w:val="19"/>
               </w:rPr>
-              <w:t xml:space="preserve">STRAIGHT_2_SECONDS = 3.0</w:t>
+              <w:t xml:space="preserve">TIME_BACK = 3.0</w:t>
             </w:r>
           </w:p>
         </w:tc>
@@ -2651,7 +2651,7 @@
                 <w:sz w:val="19"/>
                 <w:szCs w:val="19"/>
               </w:rPr>
-              <w:t xml:space="preserve">time.sleep(STRAIGHT_2_SECONDS)</w:t>
+              <w:t xml:space="preserve">time.sleep(TIME_BACK)</w:t>
             </w:r>
           </w:p>
         </w:tc>
@@ -2937,7 +2937,7 @@
               <w:sz w:val="17"/>
               <w:szCs w:val="17"/>
             </w:rPr>
-            <w:t xml:space="preserve">Project 05: Around the Cone  ·  V02</w:t>
+            <w:t xml:space="preserve">Project 05: Around the Cone  ·  V03</w:t>
           </w:r>
         </w:p>
       </w:tc>

</xml_diff>